<commit_message>
md to doc 최적화
</commit_message>
<xml_diff>
--- a/src/helper_md_doc/reference.docx
+++ b/src/helper_md_doc/reference.docx
@@ -715,6 +715,192 @@
   </w:num>
   <w:num w:numId="32" w16cid:durableId="554391957">
     <w:abstractNumId w:val="1"/>
+  </w:num>
+  <w:num w:numId="33" w16cid:durableId="1293901170">
+    <w:abstractNumId w:val="11"/>
+  </w:num>
+  <w:num w:numId="34" w16cid:durableId="721827227">
+    <w:abstractNumId w:val="0"/>
+  </w:num>
+  <w:num w:numId="35" w16cid:durableId="2062438968">
+    <w:abstractNumId w:val="12"/>
+    <w:lvlOverride w:ilvl="0">
+      <w:startOverride w:val="1"/>
+    </w:lvlOverride>
+    <w:lvlOverride w:ilvl="1">
+      <w:startOverride w:val="1"/>
+    </w:lvlOverride>
+    <w:lvlOverride w:ilvl="2">
+      <w:startOverride w:val="1"/>
+    </w:lvlOverride>
+    <w:lvlOverride w:ilvl="3">
+      <w:startOverride w:val="1"/>
+    </w:lvlOverride>
+    <w:lvlOverride w:ilvl="4">
+      <w:startOverride w:val="1"/>
+    </w:lvlOverride>
+    <w:lvlOverride w:ilvl="5">
+      <w:startOverride w:val="1"/>
+    </w:lvlOverride>
+    <w:lvlOverride w:ilvl="6">
+      <w:startOverride w:val="1"/>
+    </w:lvlOverride>
+    <w:lvlOverride w:ilvl="7">
+      <w:startOverride w:val="1"/>
+    </w:lvlOverride>
+    <w:lvlOverride w:ilvl="8">
+      <w:startOverride w:val="1"/>
+    </w:lvlOverride>
+  </w:num>
+  <w:num w:numId="36" w16cid:durableId="1168710217">
+    <w:abstractNumId w:val="0"/>
+  </w:num>
+  <w:num w:numId="37" w16cid:durableId="1627815156">
+    <w:abstractNumId w:val="0"/>
+  </w:num>
+  <w:num w:numId="38" w16cid:durableId="306251581">
+    <w:abstractNumId w:val="0"/>
+  </w:num>
+  <w:num w:numId="39" w16cid:durableId="731316649">
+    <w:abstractNumId w:val="0"/>
+  </w:num>
+  <w:num w:numId="40" w16cid:durableId="536963928">
+    <w:abstractNumId w:val="0"/>
+  </w:num>
+  <w:num w:numId="41" w16cid:durableId="2094741254">
+    <w:abstractNumId w:val="0"/>
+  </w:num>
+  <w:num w:numId="42" w16cid:durableId="36977255">
+    <w:abstractNumId w:val="0"/>
+  </w:num>
+  <w:num w:numId="43" w16cid:durableId="56786181">
+    <w:abstractNumId w:val="0"/>
+  </w:num>
+  <w:num w:numId="44" w16cid:durableId="1174107769">
+    <w:abstractNumId w:val="12"/>
+    <w:lvlOverride w:ilvl="0">
+      <w:startOverride w:val="1"/>
+    </w:lvlOverride>
+    <w:lvlOverride w:ilvl="1">
+      <w:startOverride w:val="1"/>
+    </w:lvlOverride>
+    <w:lvlOverride w:ilvl="2">
+      <w:startOverride w:val="1"/>
+    </w:lvlOverride>
+    <w:lvlOverride w:ilvl="3">
+      <w:startOverride w:val="1"/>
+    </w:lvlOverride>
+    <w:lvlOverride w:ilvl="4">
+      <w:startOverride w:val="1"/>
+    </w:lvlOverride>
+    <w:lvlOverride w:ilvl="5">
+      <w:startOverride w:val="1"/>
+    </w:lvlOverride>
+    <w:lvlOverride w:ilvl="6">
+      <w:startOverride w:val="1"/>
+    </w:lvlOverride>
+    <w:lvlOverride w:ilvl="7">
+      <w:startOverride w:val="1"/>
+    </w:lvlOverride>
+    <w:lvlOverride w:ilvl="8">
+      <w:startOverride w:val="1"/>
+    </w:lvlOverride>
+  </w:num>
+  <w:num w:numId="45" w16cid:durableId="1345014647">
+    <w:abstractNumId w:val="12"/>
+    <w:lvlOverride w:ilvl="0">
+      <w:startOverride w:val="1"/>
+    </w:lvlOverride>
+    <w:lvlOverride w:ilvl="1">
+      <w:startOverride w:val="1"/>
+    </w:lvlOverride>
+    <w:lvlOverride w:ilvl="2">
+      <w:startOverride w:val="1"/>
+    </w:lvlOverride>
+    <w:lvlOverride w:ilvl="3">
+      <w:startOverride w:val="1"/>
+    </w:lvlOverride>
+    <w:lvlOverride w:ilvl="4">
+      <w:startOverride w:val="1"/>
+    </w:lvlOverride>
+    <w:lvlOverride w:ilvl="5">
+      <w:startOverride w:val="1"/>
+    </w:lvlOverride>
+    <w:lvlOverride w:ilvl="6">
+      <w:startOverride w:val="1"/>
+    </w:lvlOverride>
+    <w:lvlOverride w:ilvl="7">
+      <w:startOverride w:val="1"/>
+    </w:lvlOverride>
+    <w:lvlOverride w:ilvl="8">
+      <w:startOverride w:val="1"/>
+    </w:lvlOverride>
+  </w:num>
+  <w:num w:numId="46" w16cid:durableId="499656602">
+    <w:abstractNumId w:val="0"/>
+  </w:num>
+  <w:num w:numId="47" w16cid:durableId="1115443148">
+    <w:abstractNumId w:val="12"/>
+    <w:lvlOverride w:ilvl="0">
+      <w:startOverride w:val="1"/>
+    </w:lvlOverride>
+    <w:lvlOverride w:ilvl="1">
+      <w:startOverride w:val="1"/>
+    </w:lvlOverride>
+    <w:lvlOverride w:ilvl="2">
+      <w:startOverride w:val="1"/>
+    </w:lvlOverride>
+    <w:lvlOverride w:ilvl="3">
+      <w:startOverride w:val="1"/>
+    </w:lvlOverride>
+    <w:lvlOverride w:ilvl="4">
+      <w:startOverride w:val="1"/>
+    </w:lvlOverride>
+    <w:lvlOverride w:ilvl="5">
+      <w:startOverride w:val="1"/>
+    </w:lvlOverride>
+    <w:lvlOverride w:ilvl="6">
+      <w:startOverride w:val="1"/>
+    </w:lvlOverride>
+    <w:lvlOverride w:ilvl="7">
+      <w:startOverride w:val="1"/>
+    </w:lvlOverride>
+    <w:lvlOverride w:ilvl="8">
+      <w:startOverride w:val="1"/>
+    </w:lvlOverride>
+  </w:num>
+  <w:num w:numId="48" w16cid:durableId="1192378702">
+    <w:abstractNumId w:val="0"/>
+  </w:num>
+  <w:num w:numId="49" w16cid:durableId="866410826">
+    <w:abstractNumId w:val="12"/>
+    <w:lvlOverride w:ilvl="0">
+      <w:startOverride w:val="1"/>
+    </w:lvlOverride>
+    <w:lvlOverride w:ilvl="1">
+      <w:startOverride w:val="1"/>
+    </w:lvlOverride>
+    <w:lvlOverride w:ilvl="2">
+      <w:startOverride w:val="1"/>
+    </w:lvlOverride>
+    <w:lvlOverride w:ilvl="3">
+      <w:startOverride w:val="1"/>
+    </w:lvlOverride>
+    <w:lvlOverride w:ilvl="4">
+      <w:startOverride w:val="1"/>
+    </w:lvlOverride>
+    <w:lvlOverride w:ilvl="5">
+      <w:startOverride w:val="1"/>
+    </w:lvlOverride>
+    <w:lvlOverride w:ilvl="6">
+      <w:startOverride w:val="1"/>
+    </w:lvlOverride>
+    <w:lvlOverride w:ilvl="7">
+      <w:startOverride w:val="1"/>
+    </w:lvlOverride>
+    <w:lvlOverride w:ilvl="8">
+      <w:startOverride w:val="1"/>
+    </w:lvlOverride>
   </w:num>
 </w:numbering>
 </file>
@@ -1114,7 +1300,7 @@
   <w:style w:type="paragraph" w:default="1" w:styleId="a">
     <w:name w:val="Normal"/>
     <w:qFormat/>
-    <w:rsid w:val="00B1562C"/>
+    <w:rsid w:val="00B64130"/>
     <w:pPr>
       <w:tabs>
         <w:tab w:val="left" w:pos="200"/>
@@ -1137,7 +1323,7 @@
     <w:link w:val="1Char"/>
     <w:uiPriority w:val="9"/>
     <w:qFormat/>
-    <w:rsid w:val="003738F1"/>
+    <w:rsid w:val="00B64130"/>
     <w:pPr>
       <w:keepNext/>
       <w:keepLines/>
@@ -1146,7 +1332,8 @@
     </w:pPr>
     <w:rPr>
       <w:rFonts w:cstheme="majorBidi"/>
-      <w:sz w:val="32"/>
+      <w:b/>
+      <w:sz w:val="36"/>
       <w:szCs w:val="32"/>
     </w:rPr>
   </w:style>
@@ -1158,7 +1345,7 @@
     <w:uiPriority w:val="9"/>
     <w:unhideWhenUsed/>
     <w:qFormat/>
-    <w:rsid w:val="003738F1"/>
+    <w:rsid w:val="00B64130"/>
     <w:pPr>
       <w:keepNext/>
       <w:keepLines/>
@@ -1167,7 +1354,8 @@
     </w:pPr>
     <w:rPr>
       <w:rFonts w:cstheme="majorBidi"/>
-      <w:sz w:val="28"/>
+      <w:b/>
+      <w:sz w:val="32"/>
       <w:szCs w:val="28"/>
     </w:rPr>
   </w:style>
@@ -1179,7 +1367,7 @@
     <w:uiPriority w:val="9"/>
     <w:unhideWhenUsed/>
     <w:qFormat/>
-    <w:rsid w:val="003738F1"/>
+    <w:rsid w:val="00B64130"/>
     <w:pPr>
       <w:keepNext/>
       <w:keepLines/>
@@ -1188,7 +1376,8 @@
     </w:pPr>
     <w:rPr>
       <w:rFonts w:cstheme="majorBidi"/>
-      <w:sz w:val="24"/>
+      <w:b/>
+      <w:sz w:val="28"/>
     </w:rPr>
   </w:style>
   <w:style w:type="paragraph" w:styleId="4">
@@ -1197,10 +1386,9 @@
     <w:next w:val="a"/>
     <w:link w:val="4Char"/>
     <w:uiPriority w:val="9"/>
-    <w:semiHidden/>
     <w:unhideWhenUsed/>
     <w:qFormat/>
-    <w:rsid w:val="003738F1"/>
+    <w:rsid w:val="00B64130"/>
     <w:pPr>
       <w:keepNext/>
       <w:keepLines/>
@@ -1209,6 +1397,8 @@
     </w:pPr>
     <w:rPr>
       <w:rFonts w:cstheme="majorBidi"/>
+      <w:b/>
+      <w:sz w:val="24"/>
     </w:rPr>
   </w:style>
   <w:style w:type="paragraph" w:styleId="5">
@@ -1217,10 +1407,9 @@
     <w:next w:val="a"/>
     <w:link w:val="5Char"/>
     <w:uiPriority w:val="9"/>
-    <w:semiHidden/>
     <w:unhideWhenUsed/>
     <w:qFormat/>
-    <w:rsid w:val="003738F1"/>
+    <w:rsid w:val="00B64130"/>
     <w:pPr>
       <w:keepNext/>
       <w:keepLines/>
@@ -1230,6 +1419,7 @@
     </w:pPr>
     <w:rPr>
       <w:rFonts w:cstheme="majorBidi"/>
+      <w:b/>
     </w:rPr>
   </w:style>
   <w:style w:type="paragraph" w:styleId="6">
@@ -1319,6 +1509,7 @@
   <w:style w:type="character" w:default="1" w:styleId="a0">
     <w:name w:val="Default Paragraph Font"/>
     <w:uiPriority w:val="1"/>
+    <w:semiHidden/>
     <w:unhideWhenUsed/>
   </w:style>
   <w:style w:type="table" w:default="1" w:styleId="a1">
@@ -1347,10 +1538,11 @@
     <w:basedOn w:val="a0"/>
     <w:link w:val="1"/>
     <w:uiPriority w:val="9"/>
-    <w:rsid w:val="003738F1"/>
+    <w:rsid w:val="00B64130"/>
     <w:rPr>
       <w:rFonts w:cstheme="majorBidi"/>
-      <w:sz w:val="32"/>
+      <w:b/>
+      <w:sz w:val="36"/>
       <w:szCs w:val="32"/>
     </w:rPr>
   </w:style>
@@ -1359,10 +1551,11 @@
     <w:basedOn w:val="a0"/>
     <w:link w:val="2"/>
     <w:uiPriority w:val="9"/>
-    <w:rsid w:val="003738F1"/>
+    <w:rsid w:val="00B64130"/>
     <w:rPr>
       <w:rFonts w:cstheme="majorBidi"/>
-      <w:sz w:val="28"/>
+      <w:b/>
+      <w:sz w:val="32"/>
       <w:szCs w:val="28"/>
     </w:rPr>
   </w:style>
@@ -1371,10 +1564,11 @@
     <w:basedOn w:val="a0"/>
     <w:link w:val="3"/>
     <w:uiPriority w:val="9"/>
-    <w:rsid w:val="003738F1"/>
+    <w:rsid w:val="00B64130"/>
     <w:rPr>
       <w:rFonts w:cstheme="majorBidi"/>
-      <w:sz w:val="24"/>
+      <w:b/>
+      <w:sz w:val="28"/>
     </w:rPr>
   </w:style>
   <w:style w:type="character" w:customStyle="1" w:styleId="4Char">
@@ -1382,10 +1576,11 @@
     <w:basedOn w:val="a0"/>
     <w:link w:val="4"/>
     <w:uiPriority w:val="9"/>
-    <w:semiHidden/>
-    <w:rsid w:val="003738F1"/>
+    <w:rsid w:val="00B64130"/>
     <w:rPr>
       <w:rFonts w:cstheme="majorBidi"/>
+      <w:b/>
+      <w:sz w:val="24"/>
     </w:rPr>
   </w:style>
   <w:style w:type="character" w:customStyle="1" w:styleId="5Char">
@@ -1393,10 +1588,10 @@
     <w:basedOn w:val="a0"/>
     <w:link w:val="5"/>
     <w:uiPriority w:val="9"/>
-    <w:semiHidden/>
-    <w:rsid w:val="003738F1"/>
+    <w:rsid w:val="00B64130"/>
     <w:rPr>
       <w:rFonts w:cstheme="majorBidi"/>
+      <w:b/>
     </w:rPr>
   </w:style>
   <w:style w:type="character" w:customStyle="1" w:styleId="6Char">
@@ -1450,13 +1645,14 @@
     <w:link w:val="Char"/>
     <w:uiPriority w:val="10"/>
     <w:qFormat/>
-    <w:rsid w:val="003738F1"/>
+    <w:rsid w:val="00B64130"/>
     <w:pPr>
       <w:spacing w:after="80"/>
       <w:jc w:val="center"/>
     </w:pPr>
     <w:rPr>
       <w:rFonts w:cstheme="majorBidi"/>
+      <w:b/>
       <w:color w:val="auto"/>
       <w:spacing w:val="-10"/>
       <w:kern w:val="28"/>
@@ -1469,9 +1665,10 @@
     <w:basedOn w:val="a0"/>
     <w:link w:val="a3"/>
     <w:uiPriority w:val="10"/>
-    <w:rsid w:val="003738F1"/>
+    <w:rsid w:val="00B64130"/>
     <w:rPr>
       <w:rFonts w:cstheme="majorBidi"/>
+      <w:b/>
       <w:color w:val="auto"/>
       <w:spacing w:val="-10"/>
       <w:kern w:val="28"/>
@@ -1486,7 +1683,7 @@
     <w:link w:val="Char0"/>
     <w:uiPriority w:val="11"/>
     <w:qFormat/>
-    <w:rsid w:val="003738F1"/>
+    <w:rsid w:val="00B64130"/>
     <w:pPr>
       <w:numPr>
         <w:ilvl w:val="1"/>
@@ -1496,6 +1693,7 @@
     </w:pPr>
     <w:rPr>
       <w:rFonts w:cstheme="majorBidi"/>
+      <w:b/>
       <w:color w:val="595959" w:themeColor="text1" w:themeTint="A6"/>
       <w:spacing w:val="15"/>
       <w:sz w:val="28"/>
@@ -1507,9 +1705,10 @@
     <w:basedOn w:val="a0"/>
     <w:link w:val="a4"/>
     <w:uiPriority w:val="11"/>
-    <w:rsid w:val="003738F1"/>
+    <w:rsid w:val="00B64130"/>
     <w:rPr>
       <w:rFonts w:cstheme="majorBidi"/>
+      <w:b/>
       <w:color w:val="595959" w:themeColor="text1" w:themeTint="A6"/>
       <w:spacing w:val="15"/>
       <w:sz w:val="28"/>
@@ -1848,10 +2047,9 @@
     <w:basedOn w:val="1"/>
     <w:next w:val="a"/>
     <w:uiPriority w:val="39"/>
-    <w:semiHidden/>
     <w:unhideWhenUsed/>
     <w:qFormat/>
-    <w:rsid w:val="003738F1"/>
+    <w:rsid w:val="00B64130"/>
     <w:pPr>
       <w:keepLines w:val="0"/>
       <w:spacing w:before="0" w:after="0"/>
@@ -1861,6 +2059,28 @@
       <w:sz w:val="28"/>
       <w:szCs w:val="28"/>
     </w:rPr>
+  </w:style>
+  <w:style w:type="paragraph" w:styleId="10">
+    <w:name w:val="toc 1"/>
+    <w:basedOn w:val="a"/>
+    <w:next w:val="a"/>
+    <w:autoRedefine/>
+    <w:uiPriority w:val="39"/>
+    <w:unhideWhenUsed/>
+    <w:rsid w:val="00B64130"/>
+    <w:pPr>
+      <w:tabs>
+        <w:tab w:val="clear" w:pos="200"/>
+        <w:tab w:val="clear" w:pos="400"/>
+        <w:tab w:val="clear" w:pos="600"/>
+        <w:tab w:val="clear" w:pos="800"/>
+        <w:tab w:val="clear" w:pos="1000"/>
+        <w:tab w:val="clear" w:pos="1200"/>
+        <w:tab w:val="clear" w:pos="1400"/>
+        <w:tab w:val="clear" w:pos="1600"/>
+        <w:tab w:val="clear" w:pos="1800"/>
+      </w:tabs>
+    </w:pPr>
   </w:style>
 </w:styles>
 </file>

</xml_diff>

<commit_message>
v0.6.0 In Table 스타일적용
</commit_message>
<xml_diff>
--- a/src/helper_md_doc/reference.docx
+++ b/src/helper_md_doc/reference.docx
@@ -3,16 +3,13 @@
 <w:document xmlns:wpc="http://schemas.microsoft.com/office/word/2010/wordprocessingCanvas" xmlns:cx="http://schemas.microsoft.com/office/drawing/2014/chartex" xmlns:cx1="http://schemas.microsoft.com/office/drawing/2015/9/8/chartex" xmlns:cx2="http://schemas.microsoft.com/office/drawing/2015/10/21/chartex" xmlns:cx3="http://schemas.microsoft.com/office/drawing/2016/5/9/chartex" xmlns:cx4="http://schemas.microsoft.com/office/drawing/2016/5/10/chartex" xmlns:cx5="http://schemas.microsoft.com/office/drawing/2016/5/11/chartex" xmlns:cx6="http://schemas.microsoft.com/office/drawing/2016/5/12/chartex" xmlns:cx7="http://schemas.microsoft.com/office/drawing/2016/5/13/chartex" xmlns:cx8="http://schemas.microsoft.com/office/drawing/2016/5/14/chartex" xmlns:mc="http://schemas.openxmlformats.org/markup-compatibility/2006" xmlns:aink="http://schemas.microsoft.com/office/drawing/2016/ink" xmlns:am3d="http://schemas.microsoft.com/office/drawing/2017/model3d" xmlns:o="urn:schemas-microsoft-com:office:office" xmlns:oel="http://schemas.microsoft.com/office/2019/extlst" xmlns:r="http://schemas.openxmlformats.org/officeDocument/2006/relationships" xmlns:m="http://schemas.openxmlformats.org/officeDocument/2006/math" xmlns:v="urn:schemas-microsoft-com:vml" xmlns:wp14="http://schemas.microsoft.com/office/word/2010/wordprocessingDrawing" xmlns:wp="http://schemas.openxmlformats.org/drawingml/2006/wordprocessingDrawing" xmlns:w10="urn:schemas-microsoft-com:office:word" xmlns:w="http://schemas.openxmlformats.org/wordprocessingml/2006/main" xmlns:w14="http://schemas.microsoft.com/office/word/2010/wordml" xmlns:w15="http://schemas.microsoft.com/office/word/2012/wordml" xmlns:w16cex="http://schemas.microsoft.com/office/word/2018/wordml/cex" xmlns:w16cid="http://schemas.microsoft.com/office/word/2016/wordml/cid" xmlns:w16="http://schemas.microsoft.com/office/word/2018/wordml" xmlns:w16du="http://schemas.microsoft.com/office/word/2023/wordml/word16du" xmlns:w16sdtdh="http://schemas.microsoft.com/office/word/2020/wordml/sdtdatahash" xmlns:w16sdtfl="http://schemas.microsoft.com/office/word/2024/wordml/sdtformatlock" xmlns:w16se="http://schemas.microsoft.com/office/word/2015/wordml/symex" xmlns:wpg="http://schemas.microsoft.com/office/word/2010/wordprocessingGroup" xmlns:wpi="http://schemas.microsoft.com/office/word/2010/wordprocessingInk" xmlns:wne="http://schemas.microsoft.com/office/word/2006/wordml" xmlns:wps="http://schemas.microsoft.com/office/word/2010/wordprocessingShape" mc:Ignorable="w14 w15 w16se w16cid w16 w16cex w16sdtdh w16sdtfl w16du wp14">
   <w:body>
     <w:p>
-      <w:bookmarkStart w:id="0" w:name="Xdd76b4e93e1d1e1eefc363df7625b205566acf0"/>
-      <w:bookmarkStart w:id="1" w:name="X02ba3cda1883801594b6e1b452790cc53948fda"/>
-      <w:bookmarkStart w:id="2" w:name="X5e995c107a71caeb833bb3b79f9f54781b33fa1"/>
-      <w:bookmarkEnd w:id="0"/>
-      <w:bookmarkEnd w:id="1"/>
-      <w:bookmarkEnd w:id="2"/>
+      <w:pPr>
+        <w:pStyle w:val="InTable"/>
+      </w:pPr>
     </w:p>
     <w:sectPr>
       <w:pgSz w:w="11906" w:h="16838"/>
-      <w:pgMar w:top="1701" w:right="1440" w:bottom="1440" w:left="1440" w:header="851" w:footer="992" w:gutter="0"/>
+      <w:pgMar w:top="720" w:right="720" w:bottom="720" w:left="720" w:header="851" w:footer="992" w:gutter="0"/>
       <w:cols w:space="425"/>
       <w:docGrid w:linePitch="360"/>
     </w:sectPr>
@@ -56,853 +53,6 @@
     </w:p>
   </w:footnote>
 </w:footnotes>
-</file>
-
-<file path=word/numbering.xml><?xml version="1.0" encoding="utf-8"?>
-<w:numbering xmlns:wpc="http://schemas.microsoft.com/office/word/2010/wordprocessingCanvas" xmlns:cx="http://schemas.microsoft.com/office/drawing/2014/chartex" xmlns:cx1="http://schemas.microsoft.com/office/drawing/2015/9/8/chartex" xmlns:cx2="http://schemas.microsoft.com/office/drawing/2015/10/21/chartex" xmlns:cx3="http://schemas.microsoft.com/office/drawing/2016/5/9/chartex" xmlns:cx4="http://schemas.microsoft.com/office/drawing/2016/5/10/chartex" xmlns:cx5="http://schemas.microsoft.com/office/drawing/2016/5/11/chartex" xmlns:cx6="http://schemas.microsoft.com/office/drawing/2016/5/12/chartex" xmlns:cx7="http://schemas.microsoft.com/office/drawing/2016/5/13/chartex" xmlns:cx8="http://schemas.microsoft.com/office/drawing/2016/5/14/chartex" xmlns:mc="http://schemas.openxmlformats.org/markup-compatibility/2006" xmlns:aink="http://schemas.microsoft.com/office/drawing/2016/ink" xmlns:am3d="http://schemas.microsoft.com/office/drawing/2017/model3d" xmlns:o="urn:schemas-microsoft-com:office:office" xmlns:oel="http://schemas.microsoft.com/office/2019/extlst" xmlns:r="http://schemas.openxmlformats.org/officeDocument/2006/relationships" xmlns:m="http://schemas.openxmlformats.org/officeDocument/2006/math" xmlns:v="urn:schemas-microsoft-com:vml" xmlns:wp14="http://schemas.microsoft.com/office/word/2010/wordprocessingDrawing" xmlns:wp="http://schemas.openxmlformats.org/drawingml/2006/wordprocessingDrawing" xmlns:w10="urn:schemas-microsoft-com:office:word" xmlns:w="http://schemas.openxmlformats.org/wordprocessingml/2006/main" xmlns:w14="http://schemas.microsoft.com/office/word/2010/wordml" xmlns:w15="http://schemas.microsoft.com/office/word/2012/wordml" xmlns:w16cex="http://schemas.microsoft.com/office/word/2018/wordml/cex" xmlns:w16cid="http://schemas.microsoft.com/office/word/2016/wordml/cid" xmlns:w16="http://schemas.microsoft.com/office/word/2018/wordml" xmlns:w16du="http://schemas.microsoft.com/office/word/2023/wordml/word16du" xmlns:w16sdtdh="http://schemas.microsoft.com/office/word/2020/wordml/sdtdatahash" xmlns:w16sdtfl="http://schemas.microsoft.com/office/word/2024/wordml/sdtformatlock" xmlns:w16se="http://schemas.microsoft.com/office/word/2015/wordml/symex" xmlns:wpg="http://schemas.microsoft.com/office/word/2010/wordprocessingGroup" xmlns:wpi="http://schemas.microsoft.com/office/word/2010/wordprocessingInk" xmlns:wne="http://schemas.microsoft.com/office/word/2006/wordml" xmlns:wps="http://schemas.microsoft.com/office/word/2010/wordprocessingShape" mc:Ignorable="w14 w15 w16se w16cid w16 w16cex w16sdtdh w16sdtfl w16du wp14">
-  <w:abstractNum w:abstractNumId="0" w15:restartNumberingAfterBreak="0">
-    <w:nsid w:val="EA454B4C"/>
-    <w:multiLevelType w:val="multilevel"/>
-    <w:tmpl w:val="64EABF68"/>
-    <w:lvl w:ilvl="0">
-      <w:numFmt w:val="bullet"/>
-      <w:lvlText w:val="•"/>
-      <w:lvlJc w:val="left"/>
-      <w:pPr>
-        <w:ind w:left="720" w:hanging="480"/>
-      </w:pPr>
-    </w:lvl>
-    <w:lvl w:ilvl="1">
-      <w:numFmt w:val="bullet"/>
-      <w:lvlText w:val="–"/>
-      <w:lvlJc w:val="left"/>
-      <w:pPr>
-        <w:ind w:left="1440" w:hanging="480"/>
-      </w:pPr>
-    </w:lvl>
-    <w:lvl w:ilvl="2">
-      <w:numFmt w:val="bullet"/>
-      <w:lvlText w:val="•"/>
-      <w:lvlJc w:val="left"/>
-      <w:pPr>
-        <w:ind w:left="2160" w:hanging="480"/>
-      </w:pPr>
-    </w:lvl>
-    <w:lvl w:ilvl="3">
-      <w:numFmt w:val="bullet"/>
-      <w:lvlText w:val="–"/>
-      <w:lvlJc w:val="left"/>
-      <w:pPr>
-        <w:ind w:left="2880" w:hanging="480"/>
-      </w:pPr>
-    </w:lvl>
-    <w:lvl w:ilvl="4">
-      <w:numFmt w:val="bullet"/>
-      <w:lvlText w:val="•"/>
-      <w:lvlJc w:val="left"/>
-      <w:pPr>
-        <w:ind w:left="3600" w:hanging="480"/>
-      </w:pPr>
-    </w:lvl>
-    <w:lvl w:ilvl="5">
-      <w:numFmt w:val="bullet"/>
-      <w:lvlText w:val="–"/>
-      <w:lvlJc w:val="left"/>
-      <w:pPr>
-        <w:ind w:left="4320" w:hanging="480"/>
-      </w:pPr>
-    </w:lvl>
-    <w:lvl w:ilvl="6">
-      <w:numFmt w:val="bullet"/>
-      <w:lvlText w:val="•"/>
-      <w:lvlJc w:val="left"/>
-      <w:pPr>
-        <w:ind w:left="5040" w:hanging="480"/>
-      </w:pPr>
-    </w:lvl>
-    <w:lvl w:ilvl="7">
-      <w:numFmt w:val="bullet"/>
-      <w:lvlText w:val="–"/>
-      <w:lvlJc w:val="left"/>
-      <w:pPr>
-        <w:ind w:left="5760" w:hanging="480"/>
-      </w:pPr>
-    </w:lvl>
-    <w:lvl w:ilvl="8">
-      <w:numFmt w:val="bullet"/>
-      <w:lvlText w:val="•"/>
-      <w:lvlJc w:val="left"/>
-      <w:pPr>
-        <w:ind w:left="6480" w:hanging="480"/>
-      </w:pPr>
-    </w:lvl>
-  </w:abstractNum>
-  <w:abstractNum w:abstractNumId="1" w15:restartNumberingAfterBreak="0">
-    <w:nsid w:val="FFFFFF7C"/>
-    <w:multiLevelType w:val="singleLevel"/>
-    <w:tmpl w:val="04E0636E"/>
-    <w:lvl w:ilvl="0">
-      <w:start w:val="1"/>
-      <w:numFmt w:val="decimal"/>
-      <w:lvlText w:val="%1."/>
-      <w:lvlJc w:val="left"/>
-      <w:pPr>
-        <w:tabs>
-          <w:tab w:val="num" w:pos="2062"/>
-        </w:tabs>
-        <w:ind w:leftChars="1000" w:left="2062" w:hangingChars="200" w:hanging="360"/>
-      </w:pPr>
-    </w:lvl>
-  </w:abstractNum>
-  <w:abstractNum w:abstractNumId="2" w15:restartNumberingAfterBreak="0">
-    <w:nsid w:val="FFFFFF7D"/>
-    <w:multiLevelType w:val="singleLevel"/>
-    <w:tmpl w:val="9CC84004"/>
-    <w:lvl w:ilvl="0">
-      <w:start w:val="1"/>
-      <w:numFmt w:val="decimal"/>
-      <w:lvlText w:val="%1."/>
-      <w:lvlJc w:val="left"/>
-      <w:pPr>
-        <w:tabs>
-          <w:tab w:val="num" w:pos="1637"/>
-        </w:tabs>
-        <w:ind w:leftChars="800" w:left="1637" w:hangingChars="200" w:hanging="360"/>
-      </w:pPr>
-    </w:lvl>
-  </w:abstractNum>
-  <w:abstractNum w:abstractNumId="3" w15:restartNumberingAfterBreak="0">
-    <w:nsid w:val="FFFFFF7E"/>
-    <w:multiLevelType w:val="singleLevel"/>
-    <w:tmpl w:val="D7044AF4"/>
-    <w:lvl w:ilvl="0">
-      <w:start w:val="1"/>
-      <w:numFmt w:val="decimal"/>
-      <w:lvlText w:val="%1."/>
-      <w:lvlJc w:val="left"/>
-      <w:pPr>
-        <w:tabs>
-          <w:tab w:val="num" w:pos="1212"/>
-        </w:tabs>
-        <w:ind w:leftChars="600" w:left="1212" w:hangingChars="200" w:hanging="360"/>
-      </w:pPr>
-    </w:lvl>
-  </w:abstractNum>
-  <w:abstractNum w:abstractNumId="4" w15:restartNumberingAfterBreak="0">
-    <w:nsid w:val="FFFFFF7F"/>
-    <w:multiLevelType w:val="singleLevel"/>
-    <w:tmpl w:val="CC32135E"/>
-    <w:lvl w:ilvl="0">
-      <w:start w:val="1"/>
-      <w:numFmt w:val="decimal"/>
-      <w:lvlText w:val="%1."/>
-      <w:lvlJc w:val="left"/>
-      <w:pPr>
-        <w:tabs>
-          <w:tab w:val="num" w:pos="786"/>
-        </w:tabs>
-        <w:ind w:leftChars="400" w:left="786" w:hangingChars="200" w:hanging="360"/>
-      </w:pPr>
-    </w:lvl>
-  </w:abstractNum>
-  <w:abstractNum w:abstractNumId="5" w15:restartNumberingAfterBreak="0">
-    <w:nsid w:val="FFFFFF80"/>
-    <w:multiLevelType w:val="singleLevel"/>
-    <w:tmpl w:val="0746879C"/>
-    <w:lvl w:ilvl="0">
-      <w:start w:val="1"/>
-      <w:numFmt w:val="bullet"/>
-      <w:lvlText w:val=""/>
-      <w:lvlJc w:val="left"/>
-      <w:pPr>
-        <w:tabs>
-          <w:tab w:val="num" w:pos="2062"/>
-        </w:tabs>
-        <w:ind w:leftChars="1000" w:left="2062" w:hangingChars="200" w:hanging="360"/>
-      </w:pPr>
-      <w:rPr>
-        <w:rFonts w:ascii="Wingdings" w:hAnsi="Wingdings" w:hint="default"/>
-      </w:rPr>
-    </w:lvl>
-  </w:abstractNum>
-  <w:abstractNum w:abstractNumId="6" w15:restartNumberingAfterBreak="0">
-    <w:nsid w:val="FFFFFF81"/>
-    <w:multiLevelType w:val="singleLevel"/>
-    <w:tmpl w:val="19CCE558"/>
-    <w:lvl w:ilvl="0">
-      <w:start w:val="1"/>
-      <w:numFmt w:val="bullet"/>
-      <w:lvlText w:val=""/>
-      <w:lvlJc w:val="left"/>
-      <w:pPr>
-        <w:tabs>
-          <w:tab w:val="num" w:pos="1637"/>
-        </w:tabs>
-        <w:ind w:leftChars="800" w:left="1637" w:hangingChars="200" w:hanging="360"/>
-      </w:pPr>
-      <w:rPr>
-        <w:rFonts w:ascii="Wingdings" w:hAnsi="Wingdings" w:hint="default"/>
-      </w:rPr>
-    </w:lvl>
-  </w:abstractNum>
-  <w:abstractNum w:abstractNumId="7" w15:restartNumberingAfterBreak="0">
-    <w:nsid w:val="FFFFFF82"/>
-    <w:multiLevelType w:val="singleLevel"/>
-    <w:tmpl w:val="4108580C"/>
-    <w:lvl w:ilvl="0">
-      <w:start w:val="1"/>
-      <w:numFmt w:val="bullet"/>
-      <w:lvlText w:val=""/>
-      <w:lvlJc w:val="left"/>
-      <w:pPr>
-        <w:tabs>
-          <w:tab w:val="num" w:pos="1212"/>
-        </w:tabs>
-        <w:ind w:leftChars="600" w:left="1212" w:hangingChars="200" w:hanging="360"/>
-      </w:pPr>
-      <w:rPr>
-        <w:rFonts w:ascii="Wingdings" w:hAnsi="Wingdings" w:hint="default"/>
-      </w:rPr>
-    </w:lvl>
-  </w:abstractNum>
-  <w:abstractNum w:abstractNumId="8" w15:restartNumberingAfterBreak="0">
-    <w:nsid w:val="FFFFFF83"/>
-    <w:multiLevelType w:val="singleLevel"/>
-    <w:tmpl w:val="7798987C"/>
-    <w:lvl w:ilvl="0">
-      <w:start w:val="1"/>
-      <w:numFmt w:val="bullet"/>
-      <w:lvlText w:val=""/>
-      <w:lvlJc w:val="left"/>
-      <w:pPr>
-        <w:tabs>
-          <w:tab w:val="num" w:pos="786"/>
-        </w:tabs>
-        <w:ind w:leftChars="400" w:left="786" w:hangingChars="200" w:hanging="360"/>
-      </w:pPr>
-      <w:rPr>
-        <w:rFonts w:ascii="Wingdings" w:hAnsi="Wingdings" w:hint="default"/>
-      </w:rPr>
-    </w:lvl>
-  </w:abstractNum>
-  <w:abstractNum w:abstractNumId="9" w15:restartNumberingAfterBreak="0">
-    <w:nsid w:val="FFFFFF88"/>
-    <w:multiLevelType w:val="singleLevel"/>
-    <w:tmpl w:val="C7D82C08"/>
-    <w:lvl w:ilvl="0">
-      <w:start w:val="1"/>
-      <w:numFmt w:val="decimal"/>
-      <w:lvlText w:val="%1."/>
-      <w:lvlJc w:val="left"/>
-      <w:pPr>
-        <w:tabs>
-          <w:tab w:val="num" w:pos="361"/>
-        </w:tabs>
-        <w:ind w:leftChars="200" w:left="361" w:hangingChars="200" w:hanging="360"/>
-      </w:pPr>
-    </w:lvl>
-  </w:abstractNum>
-  <w:abstractNum w:abstractNumId="10" w15:restartNumberingAfterBreak="0">
-    <w:nsid w:val="FFFFFF89"/>
-    <w:multiLevelType w:val="singleLevel"/>
-    <w:tmpl w:val="73727B10"/>
-    <w:lvl w:ilvl="0">
-      <w:start w:val="1"/>
-      <w:numFmt w:val="bullet"/>
-      <w:lvlText w:val=""/>
-      <w:lvlJc w:val="left"/>
-      <w:pPr>
-        <w:tabs>
-          <w:tab w:val="num" w:pos="361"/>
-        </w:tabs>
-        <w:ind w:leftChars="200" w:left="361" w:hangingChars="200" w:hanging="360"/>
-      </w:pPr>
-      <w:rPr>
-        <w:rFonts w:ascii="Wingdings" w:hAnsi="Wingdings" w:hint="default"/>
-      </w:rPr>
-    </w:lvl>
-  </w:abstractNum>
-  <w:abstractNum w:abstractNumId="11" w15:restartNumberingAfterBreak="0">
-    <w:nsid w:val="2C1AE401"/>
-    <w:multiLevelType w:val="multilevel"/>
-    <w:tmpl w:val="D23E3E9C"/>
-    <w:lvl w:ilvl="0">
-      <w:numFmt w:val="bullet"/>
-      <w:lvlText w:val=" "/>
-      <w:lvlJc w:val="left"/>
-      <w:pPr>
-        <w:ind w:left="720" w:hanging="480"/>
-      </w:pPr>
-    </w:lvl>
-    <w:lvl w:ilvl="1">
-      <w:numFmt w:val="bullet"/>
-      <w:lvlText w:val=" "/>
-      <w:lvlJc w:val="left"/>
-      <w:pPr>
-        <w:ind w:left="1440" w:hanging="480"/>
-      </w:pPr>
-    </w:lvl>
-    <w:lvl w:ilvl="2">
-      <w:numFmt w:val="bullet"/>
-      <w:lvlText w:val=" "/>
-      <w:lvlJc w:val="left"/>
-      <w:pPr>
-        <w:ind w:left="2160" w:hanging="480"/>
-      </w:pPr>
-    </w:lvl>
-    <w:lvl w:ilvl="3">
-      <w:numFmt w:val="bullet"/>
-      <w:lvlText w:val=" "/>
-      <w:lvlJc w:val="left"/>
-      <w:pPr>
-        <w:ind w:left="2880" w:hanging="480"/>
-      </w:pPr>
-    </w:lvl>
-    <w:lvl w:ilvl="4">
-      <w:numFmt w:val="bullet"/>
-      <w:lvlText w:val=" "/>
-      <w:lvlJc w:val="left"/>
-      <w:pPr>
-        <w:ind w:left="3600" w:hanging="480"/>
-      </w:pPr>
-    </w:lvl>
-    <w:lvl w:ilvl="5">
-      <w:numFmt w:val="bullet"/>
-      <w:lvlText w:val=" "/>
-      <w:lvlJc w:val="left"/>
-      <w:pPr>
-        <w:ind w:left="4320" w:hanging="480"/>
-      </w:pPr>
-    </w:lvl>
-    <w:lvl w:ilvl="6">
-      <w:numFmt w:val="bullet"/>
-      <w:lvlText w:val=" "/>
-      <w:lvlJc w:val="left"/>
-      <w:pPr>
-        <w:ind w:left="5040" w:hanging="480"/>
-      </w:pPr>
-    </w:lvl>
-    <w:lvl w:ilvl="7">
-      <w:numFmt w:val="bullet"/>
-      <w:lvlText w:val=" "/>
-      <w:lvlJc w:val="left"/>
-      <w:pPr>
-        <w:ind w:left="5760" w:hanging="480"/>
-      </w:pPr>
-    </w:lvl>
-    <w:lvl w:ilvl="8">
-      <w:numFmt w:val="bullet"/>
-      <w:lvlText w:val=" "/>
-      <w:lvlJc w:val="left"/>
-      <w:pPr>
-        <w:ind w:left="6480" w:hanging="480"/>
-      </w:pPr>
-    </w:lvl>
-  </w:abstractNum>
-  <w:abstractNum w:abstractNumId="12" w15:restartNumberingAfterBreak="0">
-    <w:nsid w:val="71315DCA"/>
-    <w:multiLevelType w:val="multilevel"/>
-    <w:tmpl w:val="C622BE50"/>
-    <w:lvl w:ilvl="0">
-      <w:start w:val="1"/>
-      <w:numFmt w:val="decimal"/>
-      <w:lvlText w:val="%1."/>
-      <w:lvlJc w:val="left"/>
-      <w:pPr>
-        <w:ind w:left="720" w:hanging="480"/>
-      </w:pPr>
-    </w:lvl>
-    <w:lvl w:ilvl="1">
-      <w:start w:val="1"/>
-      <w:numFmt w:val="lowerLetter"/>
-      <w:lvlText w:val="%2."/>
-      <w:lvlJc w:val="left"/>
-      <w:pPr>
-        <w:ind w:left="1440" w:hanging="480"/>
-      </w:pPr>
-    </w:lvl>
-    <w:lvl w:ilvl="2">
-      <w:start w:val="1"/>
-      <w:numFmt w:val="lowerRoman"/>
-      <w:lvlText w:val="%3."/>
-      <w:lvlJc w:val="left"/>
-      <w:pPr>
-        <w:ind w:left="2160" w:hanging="480"/>
-      </w:pPr>
-    </w:lvl>
-    <w:lvl w:ilvl="3">
-      <w:start w:val="1"/>
-      <w:numFmt w:val="decimal"/>
-      <w:lvlText w:val="%4."/>
-      <w:lvlJc w:val="left"/>
-      <w:pPr>
-        <w:ind w:left="2880" w:hanging="480"/>
-      </w:pPr>
-    </w:lvl>
-    <w:lvl w:ilvl="4">
-      <w:start w:val="1"/>
-      <w:numFmt w:val="lowerLetter"/>
-      <w:lvlText w:val="%5."/>
-      <w:lvlJc w:val="left"/>
-      <w:pPr>
-        <w:ind w:left="3600" w:hanging="480"/>
-      </w:pPr>
-    </w:lvl>
-    <w:lvl w:ilvl="5">
-      <w:start w:val="1"/>
-      <w:numFmt w:val="lowerRoman"/>
-      <w:lvlText w:val="%6."/>
-      <w:lvlJc w:val="left"/>
-      <w:pPr>
-        <w:ind w:left="4320" w:hanging="480"/>
-      </w:pPr>
-    </w:lvl>
-    <w:lvl w:ilvl="6">
-      <w:start w:val="1"/>
-      <w:numFmt w:val="decimal"/>
-      <w:lvlText w:val="%7."/>
-      <w:lvlJc w:val="left"/>
-      <w:pPr>
-        <w:ind w:left="5040" w:hanging="480"/>
-      </w:pPr>
-    </w:lvl>
-    <w:lvl w:ilvl="7">
-      <w:start w:val="1"/>
-      <w:numFmt w:val="lowerLetter"/>
-      <w:lvlText w:val="%8."/>
-      <w:lvlJc w:val="left"/>
-      <w:pPr>
-        <w:ind w:left="5760" w:hanging="480"/>
-      </w:pPr>
-    </w:lvl>
-    <w:lvl w:ilvl="8">
-      <w:start w:val="1"/>
-      <w:numFmt w:val="lowerRoman"/>
-      <w:lvlText w:val="%9."/>
-      <w:lvlJc w:val="left"/>
-      <w:pPr>
-        <w:ind w:left="6480" w:hanging="480"/>
-      </w:pPr>
-    </w:lvl>
-  </w:abstractNum>
-  <w:num w:numId="1" w16cid:durableId="989750166">
-    <w:abstractNumId w:val="11"/>
-  </w:num>
-  <w:num w:numId="2" w16cid:durableId="1424181859">
-    <w:abstractNumId w:val="0"/>
-  </w:num>
-  <w:num w:numId="3" w16cid:durableId="584263031">
-    <w:abstractNumId w:val="12"/>
-    <w:lvlOverride w:ilvl="0">
-      <w:startOverride w:val="1"/>
-    </w:lvlOverride>
-    <w:lvlOverride w:ilvl="1">
-      <w:startOverride w:val="1"/>
-    </w:lvlOverride>
-    <w:lvlOverride w:ilvl="2">
-      <w:startOverride w:val="1"/>
-    </w:lvlOverride>
-    <w:lvlOverride w:ilvl="3">
-      <w:startOverride w:val="1"/>
-    </w:lvlOverride>
-    <w:lvlOverride w:ilvl="4">
-      <w:startOverride w:val="1"/>
-    </w:lvlOverride>
-    <w:lvlOverride w:ilvl="5">
-      <w:startOverride w:val="1"/>
-    </w:lvlOverride>
-    <w:lvlOverride w:ilvl="6">
-      <w:startOverride w:val="1"/>
-    </w:lvlOverride>
-    <w:lvlOverride w:ilvl="7">
-      <w:startOverride w:val="1"/>
-    </w:lvlOverride>
-    <w:lvlOverride w:ilvl="8">
-      <w:startOverride w:val="1"/>
-    </w:lvlOverride>
-  </w:num>
-  <w:num w:numId="4" w16cid:durableId="1106997087">
-    <w:abstractNumId w:val="0"/>
-  </w:num>
-  <w:num w:numId="5" w16cid:durableId="1760559225">
-    <w:abstractNumId w:val="0"/>
-  </w:num>
-  <w:num w:numId="6" w16cid:durableId="1942033318">
-    <w:abstractNumId w:val="0"/>
-  </w:num>
-  <w:num w:numId="7" w16cid:durableId="1708334012">
-    <w:abstractNumId w:val="0"/>
-  </w:num>
-  <w:num w:numId="8" w16cid:durableId="261840320">
-    <w:abstractNumId w:val="0"/>
-  </w:num>
-  <w:num w:numId="9" w16cid:durableId="1240754506">
-    <w:abstractNumId w:val="0"/>
-  </w:num>
-  <w:num w:numId="10" w16cid:durableId="739644265">
-    <w:abstractNumId w:val="0"/>
-  </w:num>
-  <w:num w:numId="11" w16cid:durableId="814444244">
-    <w:abstractNumId w:val="0"/>
-  </w:num>
-  <w:num w:numId="12" w16cid:durableId="1740517661">
-    <w:abstractNumId w:val="12"/>
-    <w:lvlOverride w:ilvl="0">
-      <w:startOverride w:val="1"/>
-    </w:lvlOverride>
-    <w:lvlOverride w:ilvl="1">
-      <w:startOverride w:val="1"/>
-    </w:lvlOverride>
-    <w:lvlOverride w:ilvl="2">
-      <w:startOverride w:val="1"/>
-    </w:lvlOverride>
-    <w:lvlOverride w:ilvl="3">
-      <w:startOverride w:val="1"/>
-    </w:lvlOverride>
-    <w:lvlOverride w:ilvl="4">
-      <w:startOverride w:val="1"/>
-    </w:lvlOverride>
-    <w:lvlOverride w:ilvl="5">
-      <w:startOverride w:val="1"/>
-    </w:lvlOverride>
-    <w:lvlOverride w:ilvl="6">
-      <w:startOverride w:val="1"/>
-    </w:lvlOverride>
-    <w:lvlOverride w:ilvl="7">
-      <w:startOverride w:val="1"/>
-    </w:lvlOverride>
-    <w:lvlOverride w:ilvl="8">
-      <w:startOverride w:val="1"/>
-    </w:lvlOverride>
-  </w:num>
-  <w:num w:numId="13" w16cid:durableId="600836310">
-    <w:abstractNumId w:val="12"/>
-    <w:lvlOverride w:ilvl="0">
-      <w:startOverride w:val="1"/>
-    </w:lvlOverride>
-    <w:lvlOverride w:ilvl="1">
-      <w:startOverride w:val="1"/>
-    </w:lvlOverride>
-    <w:lvlOverride w:ilvl="2">
-      <w:startOverride w:val="1"/>
-    </w:lvlOverride>
-    <w:lvlOverride w:ilvl="3">
-      <w:startOverride w:val="1"/>
-    </w:lvlOverride>
-    <w:lvlOverride w:ilvl="4">
-      <w:startOverride w:val="1"/>
-    </w:lvlOverride>
-    <w:lvlOverride w:ilvl="5">
-      <w:startOverride w:val="1"/>
-    </w:lvlOverride>
-    <w:lvlOverride w:ilvl="6">
-      <w:startOverride w:val="1"/>
-    </w:lvlOverride>
-    <w:lvlOverride w:ilvl="7">
-      <w:startOverride w:val="1"/>
-    </w:lvlOverride>
-    <w:lvlOverride w:ilvl="8">
-      <w:startOverride w:val="1"/>
-    </w:lvlOverride>
-  </w:num>
-  <w:num w:numId="14" w16cid:durableId="1506436888">
-    <w:abstractNumId w:val="0"/>
-  </w:num>
-  <w:num w:numId="15" w16cid:durableId="826672187">
-    <w:abstractNumId w:val="12"/>
-    <w:lvlOverride w:ilvl="0">
-      <w:startOverride w:val="1"/>
-    </w:lvlOverride>
-    <w:lvlOverride w:ilvl="1">
-      <w:startOverride w:val="1"/>
-    </w:lvlOverride>
-    <w:lvlOverride w:ilvl="2">
-      <w:startOverride w:val="1"/>
-    </w:lvlOverride>
-    <w:lvlOverride w:ilvl="3">
-      <w:startOverride w:val="1"/>
-    </w:lvlOverride>
-    <w:lvlOverride w:ilvl="4">
-      <w:startOverride w:val="1"/>
-    </w:lvlOverride>
-    <w:lvlOverride w:ilvl="5">
-      <w:startOverride w:val="1"/>
-    </w:lvlOverride>
-    <w:lvlOverride w:ilvl="6">
-      <w:startOverride w:val="1"/>
-    </w:lvlOverride>
-    <w:lvlOverride w:ilvl="7">
-      <w:startOverride w:val="1"/>
-    </w:lvlOverride>
-    <w:lvlOverride w:ilvl="8">
-      <w:startOverride w:val="1"/>
-    </w:lvlOverride>
-  </w:num>
-  <w:num w:numId="16" w16cid:durableId="1206987738">
-    <w:abstractNumId w:val="0"/>
-  </w:num>
-  <w:num w:numId="17" w16cid:durableId="1046567738">
-    <w:abstractNumId w:val="12"/>
-    <w:lvlOverride w:ilvl="0">
-      <w:startOverride w:val="1"/>
-    </w:lvlOverride>
-    <w:lvlOverride w:ilvl="1">
-      <w:startOverride w:val="1"/>
-    </w:lvlOverride>
-    <w:lvlOverride w:ilvl="2">
-      <w:startOverride w:val="1"/>
-    </w:lvlOverride>
-    <w:lvlOverride w:ilvl="3">
-      <w:startOverride w:val="1"/>
-    </w:lvlOverride>
-    <w:lvlOverride w:ilvl="4">
-      <w:startOverride w:val="1"/>
-    </w:lvlOverride>
-    <w:lvlOverride w:ilvl="5">
-      <w:startOverride w:val="1"/>
-    </w:lvlOverride>
-    <w:lvlOverride w:ilvl="6">
-      <w:startOverride w:val="1"/>
-    </w:lvlOverride>
-    <w:lvlOverride w:ilvl="7">
-      <w:startOverride w:val="1"/>
-    </w:lvlOverride>
-    <w:lvlOverride w:ilvl="8">
-      <w:startOverride w:val="1"/>
-    </w:lvlOverride>
-  </w:num>
-  <w:num w:numId="18" w16cid:durableId="1456171059">
-    <w:abstractNumId w:val="10"/>
-  </w:num>
-  <w:num w:numId="19" w16cid:durableId="514345276">
-    <w:abstractNumId w:val="9"/>
-  </w:num>
-  <w:num w:numId="20" w16cid:durableId="1771853195">
-    <w:abstractNumId w:val="8"/>
-  </w:num>
-  <w:num w:numId="21" w16cid:durableId="1617251904">
-    <w:abstractNumId w:val="7"/>
-  </w:num>
-  <w:num w:numId="22" w16cid:durableId="1852182875">
-    <w:abstractNumId w:val="6"/>
-  </w:num>
-  <w:num w:numId="23" w16cid:durableId="630289856">
-    <w:abstractNumId w:val="5"/>
-  </w:num>
-  <w:num w:numId="24" w16cid:durableId="147206779">
-    <w:abstractNumId w:val="4"/>
-  </w:num>
-  <w:num w:numId="25" w16cid:durableId="1325235441">
-    <w:abstractNumId w:val="3"/>
-  </w:num>
-  <w:num w:numId="26" w16cid:durableId="84083699">
-    <w:abstractNumId w:val="2"/>
-  </w:num>
-  <w:num w:numId="27" w16cid:durableId="898133469">
-    <w:abstractNumId w:val="1"/>
-  </w:num>
-  <w:num w:numId="28" w16cid:durableId="1886326770">
-    <w:abstractNumId w:val="9"/>
-  </w:num>
-  <w:num w:numId="29" w16cid:durableId="1226529763">
-    <w:abstractNumId w:val="4"/>
-  </w:num>
-  <w:num w:numId="30" w16cid:durableId="275409495">
-    <w:abstractNumId w:val="3"/>
-  </w:num>
-  <w:num w:numId="31" w16cid:durableId="1393390314">
-    <w:abstractNumId w:val="2"/>
-  </w:num>
-  <w:num w:numId="32" w16cid:durableId="554391957">
-    <w:abstractNumId w:val="1"/>
-  </w:num>
-  <w:num w:numId="33" w16cid:durableId="1293901170">
-    <w:abstractNumId w:val="11"/>
-  </w:num>
-  <w:num w:numId="34" w16cid:durableId="721827227">
-    <w:abstractNumId w:val="0"/>
-  </w:num>
-  <w:num w:numId="35" w16cid:durableId="2062438968">
-    <w:abstractNumId w:val="12"/>
-    <w:lvlOverride w:ilvl="0">
-      <w:startOverride w:val="1"/>
-    </w:lvlOverride>
-    <w:lvlOverride w:ilvl="1">
-      <w:startOverride w:val="1"/>
-    </w:lvlOverride>
-    <w:lvlOverride w:ilvl="2">
-      <w:startOverride w:val="1"/>
-    </w:lvlOverride>
-    <w:lvlOverride w:ilvl="3">
-      <w:startOverride w:val="1"/>
-    </w:lvlOverride>
-    <w:lvlOverride w:ilvl="4">
-      <w:startOverride w:val="1"/>
-    </w:lvlOverride>
-    <w:lvlOverride w:ilvl="5">
-      <w:startOverride w:val="1"/>
-    </w:lvlOverride>
-    <w:lvlOverride w:ilvl="6">
-      <w:startOverride w:val="1"/>
-    </w:lvlOverride>
-    <w:lvlOverride w:ilvl="7">
-      <w:startOverride w:val="1"/>
-    </w:lvlOverride>
-    <w:lvlOverride w:ilvl="8">
-      <w:startOverride w:val="1"/>
-    </w:lvlOverride>
-  </w:num>
-  <w:num w:numId="36" w16cid:durableId="1168710217">
-    <w:abstractNumId w:val="0"/>
-  </w:num>
-  <w:num w:numId="37" w16cid:durableId="1627815156">
-    <w:abstractNumId w:val="0"/>
-  </w:num>
-  <w:num w:numId="38" w16cid:durableId="306251581">
-    <w:abstractNumId w:val="0"/>
-  </w:num>
-  <w:num w:numId="39" w16cid:durableId="731316649">
-    <w:abstractNumId w:val="0"/>
-  </w:num>
-  <w:num w:numId="40" w16cid:durableId="536963928">
-    <w:abstractNumId w:val="0"/>
-  </w:num>
-  <w:num w:numId="41" w16cid:durableId="2094741254">
-    <w:abstractNumId w:val="0"/>
-  </w:num>
-  <w:num w:numId="42" w16cid:durableId="36977255">
-    <w:abstractNumId w:val="0"/>
-  </w:num>
-  <w:num w:numId="43" w16cid:durableId="56786181">
-    <w:abstractNumId w:val="0"/>
-  </w:num>
-  <w:num w:numId="44" w16cid:durableId="1174107769">
-    <w:abstractNumId w:val="12"/>
-    <w:lvlOverride w:ilvl="0">
-      <w:startOverride w:val="1"/>
-    </w:lvlOverride>
-    <w:lvlOverride w:ilvl="1">
-      <w:startOverride w:val="1"/>
-    </w:lvlOverride>
-    <w:lvlOverride w:ilvl="2">
-      <w:startOverride w:val="1"/>
-    </w:lvlOverride>
-    <w:lvlOverride w:ilvl="3">
-      <w:startOverride w:val="1"/>
-    </w:lvlOverride>
-    <w:lvlOverride w:ilvl="4">
-      <w:startOverride w:val="1"/>
-    </w:lvlOverride>
-    <w:lvlOverride w:ilvl="5">
-      <w:startOverride w:val="1"/>
-    </w:lvlOverride>
-    <w:lvlOverride w:ilvl="6">
-      <w:startOverride w:val="1"/>
-    </w:lvlOverride>
-    <w:lvlOverride w:ilvl="7">
-      <w:startOverride w:val="1"/>
-    </w:lvlOverride>
-    <w:lvlOverride w:ilvl="8">
-      <w:startOverride w:val="1"/>
-    </w:lvlOverride>
-  </w:num>
-  <w:num w:numId="45" w16cid:durableId="1345014647">
-    <w:abstractNumId w:val="12"/>
-    <w:lvlOverride w:ilvl="0">
-      <w:startOverride w:val="1"/>
-    </w:lvlOverride>
-    <w:lvlOverride w:ilvl="1">
-      <w:startOverride w:val="1"/>
-    </w:lvlOverride>
-    <w:lvlOverride w:ilvl="2">
-      <w:startOverride w:val="1"/>
-    </w:lvlOverride>
-    <w:lvlOverride w:ilvl="3">
-      <w:startOverride w:val="1"/>
-    </w:lvlOverride>
-    <w:lvlOverride w:ilvl="4">
-      <w:startOverride w:val="1"/>
-    </w:lvlOverride>
-    <w:lvlOverride w:ilvl="5">
-      <w:startOverride w:val="1"/>
-    </w:lvlOverride>
-    <w:lvlOverride w:ilvl="6">
-      <w:startOverride w:val="1"/>
-    </w:lvlOverride>
-    <w:lvlOverride w:ilvl="7">
-      <w:startOverride w:val="1"/>
-    </w:lvlOverride>
-    <w:lvlOverride w:ilvl="8">
-      <w:startOverride w:val="1"/>
-    </w:lvlOverride>
-  </w:num>
-  <w:num w:numId="46" w16cid:durableId="499656602">
-    <w:abstractNumId w:val="0"/>
-  </w:num>
-  <w:num w:numId="47" w16cid:durableId="1115443148">
-    <w:abstractNumId w:val="12"/>
-    <w:lvlOverride w:ilvl="0">
-      <w:startOverride w:val="1"/>
-    </w:lvlOverride>
-    <w:lvlOverride w:ilvl="1">
-      <w:startOverride w:val="1"/>
-    </w:lvlOverride>
-    <w:lvlOverride w:ilvl="2">
-      <w:startOverride w:val="1"/>
-    </w:lvlOverride>
-    <w:lvlOverride w:ilvl="3">
-      <w:startOverride w:val="1"/>
-    </w:lvlOverride>
-    <w:lvlOverride w:ilvl="4">
-      <w:startOverride w:val="1"/>
-    </w:lvlOverride>
-    <w:lvlOverride w:ilvl="5">
-      <w:startOverride w:val="1"/>
-    </w:lvlOverride>
-    <w:lvlOverride w:ilvl="6">
-      <w:startOverride w:val="1"/>
-    </w:lvlOverride>
-    <w:lvlOverride w:ilvl="7">
-      <w:startOverride w:val="1"/>
-    </w:lvlOverride>
-    <w:lvlOverride w:ilvl="8">
-      <w:startOverride w:val="1"/>
-    </w:lvlOverride>
-  </w:num>
-  <w:num w:numId="48" w16cid:durableId="1192378702">
-    <w:abstractNumId w:val="0"/>
-  </w:num>
-  <w:num w:numId="49" w16cid:durableId="866410826">
-    <w:abstractNumId w:val="12"/>
-    <w:lvlOverride w:ilvl="0">
-      <w:startOverride w:val="1"/>
-    </w:lvlOverride>
-    <w:lvlOverride w:ilvl="1">
-      <w:startOverride w:val="1"/>
-    </w:lvlOverride>
-    <w:lvlOverride w:ilvl="2">
-      <w:startOverride w:val="1"/>
-    </w:lvlOverride>
-    <w:lvlOverride w:ilvl="3">
-      <w:startOverride w:val="1"/>
-    </w:lvlOverride>
-    <w:lvlOverride w:ilvl="4">
-      <w:startOverride w:val="1"/>
-    </w:lvlOverride>
-    <w:lvlOverride w:ilvl="5">
-      <w:startOverride w:val="1"/>
-    </w:lvlOverride>
-    <w:lvlOverride w:ilvl="6">
-      <w:startOverride w:val="1"/>
-    </w:lvlOverride>
-    <w:lvlOverride w:ilvl="7">
-      <w:startOverride w:val="1"/>
-    </w:lvlOverride>
-    <w:lvlOverride w:ilvl="8">
-      <w:startOverride w:val="1"/>
-    </w:lvlOverride>
-  </w:num>
-</w:numbering>
 </file>
 
 <file path=word/styles.xml><?xml version="1.0" encoding="utf-8"?>
@@ -1323,7 +473,7 @@
     <w:link w:val="1Char"/>
     <w:uiPriority w:val="9"/>
     <w:qFormat/>
-    <w:rsid w:val="00B64130"/>
+    <w:rsid w:val="00383EB4"/>
     <w:pPr>
       <w:keepNext/>
       <w:keepLines/>
@@ -1333,7 +483,7 @@
     <w:rPr>
       <w:rFonts w:cstheme="majorBidi"/>
       <w:b/>
-      <w:sz w:val="36"/>
+      <w:sz w:val="28"/>
       <w:szCs w:val="32"/>
     </w:rPr>
   </w:style>
@@ -1345,7 +495,7 @@
     <w:uiPriority w:val="9"/>
     <w:unhideWhenUsed/>
     <w:qFormat/>
-    <w:rsid w:val="00B64130"/>
+    <w:rsid w:val="00383EB4"/>
     <w:pPr>
       <w:keepNext/>
       <w:keepLines/>
@@ -1355,7 +505,7 @@
     <w:rPr>
       <w:rFonts w:cstheme="majorBidi"/>
       <w:b/>
-      <w:sz w:val="32"/>
+      <w:sz w:val="24"/>
       <w:szCs w:val="28"/>
     </w:rPr>
   </w:style>
@@ -1367,7 +517,7 @@
     <w:uiPriority w:val="9"/>
     <w:unhideWhenUsed/>
     <w:qFormat/>
-    <w:rsid w:val="00B64130"/>
+    <w:rsid w:val="00383EB4"/>
     <w:pPr>
       <w:keepNext/>
       <w:keepLines/>
@@ -1377,7 +527,6 @@
     <w:rPr>
       <w:rFonts w:cstheme="majorBidi"/>
       <w:b/>
-      <w:sz w:val="28"/>
     </w:rPr>
   </w:style>
   <w:style w:type="paragraph" w:styleId="4">
@@ -1388,7 +537,7 @@
     <w:uiPriority w:val="9"/>
     <w:unhideWhenUsed/>
     <w:qFormat/>
-    <w:rsid w:val="00B64130"/>
+    <w:rsid w:val="00D7623F"/>
     <w:pPr>
       <w:keepNext/>
       <w:keepLines/>
@@ -1398,7 +547,6 @@
     <w:rPr>
       <w:rFonts w:cstheme="majorBidi"/>
       <w:b/>
-      <w:sz w:val="24"/>
     </w:rPr>
   </w:style>
   <w:style w:type="paragraph" w:styleId="5">
@@ -1538,11 +686,11 @@
     <w:basedOn w:val="a0"/>
     <w:link w:val="1"/>
     <w:uiPriority w:val="9"/>
-    <w:rsid w:val="00B64130"/>
-    <w:rPr>
-      <w:rFonts w:cstheme="majorBidi"/>
-      <w:b/>
-      <w:sz w:val="36"/>
+    <w:rsid w:val="00383EB4"/>
+    <w:rPr>
+      <w:rFonts w:cstheme="majorBidi"/>
+      <w:b/>
+      <w:sz w:val="28"/>
       <w:szCs w:val="32"/>
     </w:rPr>
   </w:style>
@@ -1551,11 +699,11 @@
     <w:basedOn w:val="a0"/>
     <w:link w:val="2"/>
     <w:uiPriority w:val="9"/>
-    <w:rsid w:val="00B64130"/>
-    <w:rPr>
-      <w:rFonts w:cstheme="majorBidi"/>
-      <w:b/>
-      <w:sz w:val="32"/>
+    <w:rsid w:val="00383EB4"/>
+    <w:rPr>
+      <w:rFonts w:cstheme="majorBidi"/>
+      <w:b/>
+      <w:sz w:val="24"/>
       <w:szCs w:val="28"/>
     </w:rPr>
   </w:style>
@@ -1564,11 +712,10 @@
     <w:basedOn w:val="a0"/>
     <w:link w:val="3"/>
     <w:uiPriority w:val="9"/>
-    <w:rsid w:val="00B64130"/>
-    <w:rPr>
-      <w:rFonts w:cstheme="majorBidi"/>
-      <w:b/>
-      <w:sz w:val="28"/>
+    <w:rsid w:val="00383EB4"/>
+    <w:rPr>
+      <w:rFonts w:cstheme="majorBidi"/>
+      <w:b/>
     </w:rPr>
   </w:style>
   <w:style w:type="character" w:customStyle="1" w:styleId="4Char">
@@ -1576,11 +723,10 @@
     <w:basedOn w:val="a0"/>
     <w:link w:val="4"/>
     <w:uiPriority w:val="9"/>
-    <w:rsid w:val="00B64130"/>
-    <w:rPr>
-      <w:rFonts w:cstheme="majorBidi"/>
-      <w:b/>
-      <w:sz w:val="24"/>
+    <w:rsid w:val="00D7623F"/>
+    <w:rPr>
+      <w:rFonts w:cstheme="majorBidi"/>
+      <w:b/>
     </w:rPr>
   </w:style>
   <w:style w:type="character" w:customStyle="1" w:styleId="5Char">
@@ -1645,7 +791,7 @@
     <w:link w:val="Char"/>
     <w:uiPriority w:val="10"/>
     <w:qFormat/>
-    <w:rsid w:val="00B64130"/>
+    <w:rsid w:val="00D7623F"/>
     <w:pPr>
       <w:spacing w:after="80"/>
       <w:jc w:val="center"/>
@@ -1656,7 +802,7 @@
       <w:color w:val="auto"/>
       <w:spacing w:val="-10"/>
       <w:kern w:val="28"/>
-      <w:sz w:val="56"/>
+      <w:sz w:val="40"/>
       <w:szCs w:val="56"/>
     </w:rPr>
   </w:style>
@@ -1665,14 +811,14 @@
     <w:basedOn w:val="a0"/>
     <w:link w:val="a3"/>
     <w:uiPriority w:val="10"/>
-    <w:rsid w:val="00B64130"/>
+    <w:rsid w:val="00D7623F"/>
     <w:rPr>
       <w:rFonts w:cstheme="majorBidi"/>
       <w:b/>
       <w:color w:val="auto"/>
       <w:spacing w:val="-10"/>
       <w:kern w:val="28"/>
-      <w:sz w:val="56"/>
+      <w:sz w:val="40"/>
       <w:szCs w:val="56"/>
     </w:rPr>
   </w:style>
@@ -2056,7 +1202,6 @@
       <w:outlineLvl w:val="9"/>
     </w:pPr>
     <w:rPr>
-      <w:sz w:val="28"/>
       <w:szCs w:val="28"/>
     </w:rPr>
   </w:style>
@@ -2082,18 +1227,12 @@
       </w:tabs>
     </w:pPr>
   </w:style>
-  <w:style w:type="table" w:styleId="TableGrid">
+  <w:style w:type="table" w:styleId="ab">
     <w:name w:val="Table Grid"/>
-    <w:basedOn w:val="TableNormal"/>
     <w:uiPriority w:val="59"/>
     <w:pPr>
-      <w:spacing w:after="0" w:line="240" w:lineRule="auto"/>
       <w:jc w:val="center"/>
     </w:pPr>
-    <w:rPr>
-      <w:sz w:val="20"/>
-      <w:szCs w:val="20"/>
-    </w:rPr>
     <w:tblPr>
       <w:tblBorders>
         <w:top w:val="single" w:sz="4" w:space="0" w:color="000000"/>
@@ -2103,10 +1242,35 @@
         <w:insideH w:val="single" w:sz="4" w:space="0" w:color="000000"/>
         <w:insideV w:val="single" w:sz="4" w:space="0" w:color="000000"/>
       </w:tblBorders>
+      <w:tblCellMar>
+        <w:top w:w="0" w:type="dxa"/>
+        <w:left w:w="0" w:type="dxa"/>
+        <w:bottom w:w="0" w:type="dxa"/>
+        <w:right w:w="0" w:type="dxa"/>
+      </w:tblCellMar>
     </w:tblPr>
     <w:tcPr>
       <w:vAlign w:val="center"/>
     </w:tcPr>
+  </w:style>
+  <w:style w:type="paragraph" w:customStyle="1" w:styleId="InTable">
+    <w:name w:val="In Table"/>
+    <w:basedOn w:val="a"/>
+    <w:link w:val="InTableChar"/>
+    <w:qFormat/>
+    <w:rsid w:val="00896F7E"/>
+    <w:rPr>
+      <w:sz w:val="16"/>
+    </w:rPr>
+  </w:style>
+  <w:style w:type="character" w:customStyle="1" w:styleId="InTableChar">
+    <w:name w:val="In Table Char"/>
+    <w:basedOn w:val="a0"/>
+    <w:link w:val="InTable"/>
+    <w:rsid w:val="00896F7E"/>
+    <w:rPr>
+      <w:sz w:val="16"/>
+    </w:rPr>
   </w:style>
 </w:styles>
 </file>

</xml_diff>